<commit_message>
docs: adiciona mapeamento dos 6 relacionamentos POO e superclasse Pessoa na documentacao e apresentacao ABNT
</commit_message>
<xml_diff>
--- a/APRESENTACAO_ABNT.docx
+++ b/APRESENTACAO_ABNT.docx
@@ -209,6 +209,23 @@
       <w:r>
         <w:rPr>
           <w:rFonts w:ascii="Times New Roman" w:hAnsi="Times New Roman"/>
+          <w:b w:val="0"/>
+          <w:sz w:val="24"/>
+        </w:rPr>
+        <w:t>2.5  Relacionamentos entre Classes na POO</w:t>
+      </w:r>
+    </w:p>
+    <w:p>
+      <w:pPr>
+        <w:tabs>
+          <w:tab w:pos="7937" w:val="left"/>
+        </w:tabs>
+        <w:spacing w:before="0" w:after="120" w:line="240" w:lineRule="auto"/>
+        <w:jc w:val="both"/>
+      </w:pPr>
+      <w:r>
+        <w:rPr>
+          <w:rFonts w:ascii="Times New Roman" w:hAnsi="Times New Roman"/>
           <w:b/>
           <w:sz w:val="24"/>
         </w:rPr>
@@ -281,6 +298,23 @@
           <w:sz w:val="24"/>
         </w:rPr>
         <w:t>3.4  OrdemServicoDAOJDBC — Padrão DAO</w:t>
+      </w:r>
+    </w:p>
+    <w:p>
+      <w:pPr>
+        <w:tabs>
+          <w:tab w:pos="7937" w:val="left"/>
+        </w:tabs>
+        <w:spacing w:before="0" w:after="120" w:line="240" w:lineRule="auto"/>
+        <w:jc w:val="both"/>
+      </w:pPr>
+      <w:r>
+        <w:rPr>
+          <w:rFonts w:ascii="Times New Roman" w:hAnsi="Times New Roman"/>
+          <w:b w:val="0"/>
+          <w:sz w:val="24"/>
+        </w:rPr>
+        <w:t>3.5  Pessoa — Superclasse Abstrata e Herança</w:t>
       </w:r>
     </w:p>
     <w:p>
@@ -691,6 +725,118 @@
       </w:r>
     </w:p>
     <w:p>
+      <w:pPr>
+        <w:spacing w:before="480" w:after="240" w:line="360" w:lineRule="auto"/>
+        <w:jc w:val="left"/>
+      </w:pPr>
+      <w:r>
+        <w:rPr>
+          <w:rFonts w:ascii="Times New Roman" w:hAnsi="Times New Roman"/>
+          <w:b/>
+          <w:sz w:val="24"/>
+        </w:rPr>
+        <w:t>2.5  Relacionamentos entre Classes na Programação Orientada a Objetos</w:t>
+      </w:r>
+    </w:p>
+    <w:p>
+      <w:pPr>
+        <w:spacing w:line="360" w:lineRule="auto" w:before="0" w:after="0"/>
+        <w:ind w:firstLine="709"/>
+        <w:jc w:val="both"/>
+      </w:pPr>
+      <w:r>
+        <w:rPr>
+          <w:rFonts w:ascii="Times New Roman" w:hAnsi="Times New Roman"/>
+          <w:sz w:val="24"/>
+        </w:rPr>
+        <w:t>O sistema atende integralmente aos 6 conceitos fundamentais de relacionamento entre classes na POO, conforme a teoria clássica e o material instrucional de Engenharia de Software:</w:t>
+      </w:r>
+    </w:p>
+    <w:p>
+      <w:pPr>
+        <w:spacing w:line="360" w:lineRule="auto" w:before="0" w:after="0"/>
+        <w:ind w:firstLine="709"/>
+        <w:jc w:val="both"/>
+      </w:pPr>
+      <w:r>
+        <w:rPr>
+          <w:rFonts w:ascii="Times New Roman" w:hAnsi="Times New Roman"/>
+          <w:sz w:val="24"/>
+        </w:rPr>
+        <w:t>1. Dependência (Uso Temporário): Uma classe depende de outra quando a recebe como parâmetro de método ou instancia localmente de forma transitória. Exemplo: OrcamentoAprovarCommand depende de OrcamentoService e OrdemServicoService.</w:t>
+      </w:r>
+    </w:p>
+    <w:p>
+      <w:pPr>
+        <w:spacing w:line="360" w:lineRule="auto" w:before="0" w:after="0"/>
+        <w:ind w:firstLine="709"/>
+        <w:jc w:val="both"/>
+      </w:pPr>
+      <w:r>
+        <w:rPr>
+          <w:rFonts w:ascii="Times New Roman" w:hAnsi="Times New Roman"/>
+          <w:sz w:val="24"/>
+        </w:rPr>
+        <w:t>2. Associação 1:1 (Um para Um): Relacionamento estrutural direto e exclusivo. Exemplo: OrdemServico associa-se exclusivamente a uma FichaTecnica (chave estrangeira ordem_servico_id UNIQUE).</w:t>
+      </w:r>
+    </w:p>
+    <w:p>
+      <w:pPr>
+        <w:spacing w:line="360" w:lineRule="auto" w:before="0" w:after="0"/>
+        <w:ind w:firstLine="709"/>
+        <w:jc w:val="both"/>
+      </w:pPr>
+      <w:r>
+        <w:rPr>
+          <w:rFonts w:ascii="Times New Roman" w:hAnsi="Times New Roman"/>
+          <w:sz w:val="24"/>
+        </w:rPr>
+        <w:t>3. Associação 1:N (Um para Muitos): Relacionamento estrutural em que um objeto possui referência a múltiplos elementos. Exemplo: Cliente possui 0..* Equipamentos; Equipamento possui 0..* Orcamentos.</w:t>
+      </w:r>
+    </w:p>
+    <w:p>
+      <w:pPr>
+        <w:spacing w:line="360" w:lineRule="auto" w:before="0" w:after="0"/>
+        <w:ind w:firstLine="709"/>
+        <w:jc w:val="both"/>
+      </w:pPr>
+      <w:r>
+        <w:rPr>
+          <w:rFonts w:ascii="Times New Roman" w:hAnsi="Times New Roman"/>
+          <w:sz w:val="24"/>
+        </w:rPr>
+        <w:t>4. Agregação e Composição (Todo-Parte): Vínculos de ciclo de vida onde partes integram um todo. A relação entre Ordem de Serviço e Ficha Técnica opera como composição conceitual no ciclo de vida do atendimento (criadas e removidas em conjunto pelo Service).</w:t>
+      </w:r>
+    </w:p>
+    <w:p>
+      <w:pPr>
+        <w:spacing w:line="360" w:lineRule="auto" w:before="0" w:after="0"/>
+        <w:ind w:firstLine="709"/>
+        <w:jc w:val="both"/>
+      </w:pPr>
+      <w:r>
+        <w:rPr>
+          <w:rFonts w:ascii="Times New Roman" w:hAnsi="Times New Roman"/>
+          <w:sz w:val="24"/>
+        </w:rPr>
+        <w:t>5. Herança / Generalização (Superclasse Abstrata): Reutilização e polimorfismo estrutural. A superclasse abstrata Pessoa encapsula os atributos id, nome e email, sendo estendida pelas subclasses concretas Cliente e Usuario (eliminando duplicação de código — Princípio DRY).</w:t>
+      </w:r>
+    </w:p>
+    <w:p>
+      <w:pPr>
+        <w:spacing w:line="360" w:lineRule="auto" w:before="0" w:after="0"/>
+        <w:ind w:firstLine="709"/>
+        <w:jc w:val="both"/>
+      </w:pPr>
+      <w:r>
+        <w:rPr>
+          <w:rFonts w:ascii="Times New Roman" w:hAnsi="Times New Roman"/>
+          <w:sz w:val="24"/>
+        </w:rPr>
+        <w:t>6. Implementação / Realização (Interface-Classe): Uma classe concreta assume o contrato estipulado por uma interface. Exemplo: ClienteDAOJDBC implementa ClienteDAO, e os 28 commands implementam ICommand.</w:t>
+      </w:r>
+    </w:p>
+    <w:p>
       <w:r>
         <w:br w:type="page"/>
       </w:r>
@@ -953,6 +1099,64 @@
           <w:sz w:val="24"/>
         </w:rPr>
         <w:t>Como citar durante a defesa: 'Observe os parâmetros: inserir(Connection conn, OrdemServico os). A injeção da Connection aqui é a prova de que o padrão DAO está implementado corretamente, pois permite que o Service controle o ciclo de vida da transação integralmente.'</w:t>
+      </w:r>
+    </w:p>
+    <w:p>
+      <w:pPr>
+        <w:spacing w:before="480" w:after="240" w:line="360" w:lineRule="auto"/>
+        <w:jc w:val="left"/>
+      </w:pPr>
+      <w:r>
+        <w:rPr>
+          <w:rFonts w:ascii="Times New Roman" w:hAnsi="Times New Roman"/>
+          <w:b/>
+          <w:sz w:val="24"/>
+        </w:rPr>
+        <w:t>3.5  Pessoa — Superclasse Abstrata e Herança</w:t>
+      </w:r>
+    </w:p>
+    <w:p>
+      <w:pPr>
+        <w:spacing w:before="240" w:after="40"/>
+        <w:jc w:val="left"/>
+      </w:pPr>
+      <w:r>
+        <w:rPr>
+          <w:rFonts w:ascii="Courier New" w:hAnsi="Courier New"/>
+          <w:b/>
+          <w:color w:val="00008B"/>
+          <w:sz w:val="18"/>
+        </w:rPr>
+        <w:t>Arquivo: src/main/java/com/assistencia/model/Pessoa.java  |  Linhas: Declaração: public abstract class Pessoa</w:t>
+      </w:r>
+    </w:p>
+    <w:p>
+      <w:pPr>
+        <w:spacing w:before="0" w:after="80"/>
+        <w:ind w:left="567"/>
+      </w:pPr>
+      <w:r>
+        <w:rPr>
+          <w:rFonts w:ascii="Times New Roman" w:hAnsi="Times New Roman"/>
+          <w:i/>
+          <w:color w:val="3C3C3C"/>
+          <w:sz w:val="20"/>
+        </w:rPr>
+        <w:t>Superclasse abstrata que encapsula os atributos id, nome e email comuns a qualquer pessoa do sistema. As classes Cliente e Usuario estendem Pessoa (extends Pessoa), aproveitando os atributos herdados e adicionando apenas seus atributos especializados (ex: CPF/telefone para Cliente, senha/cargo para Usuario).</w:t>
+      </w:r>
+    </w:p>
+    <w:p>
+      <w:pPr>
+        <w:spacing w:line="360" w:lineRule="auto" w:before="0" w:after="0"/>
+        <w:ind w:firstLine="709"/>
+        <w:jc w:val="both"/>
+      </w:pPr>
+      <w:r>
+        <w:rPr>
+          <w:rFonts w:ascii="Times New Roman" w:hAnsi="Times New Roman"/>
+          <w:sz w:val="24"/>
+        </w:rPr>
+        <w:t>Como citar durante a defesa: 'Professor, a classe abstrata Pessoa demonstra o princípio de Herança e Generalização/Especialização em POO. Cliente e Usuario herdam id, nome e email, eliminando duplicação e facilitando a extensão do modelo.'</w:t>
       </w:r>
     </w:p>
     <w:p>
@@ -1977,6 +2181,55 @@
           <w:sz w:val="24"/>
         </w:rPr>
         <w:t>Essas entidades possuem muitos atributos opcionais. Sem o Builder, o construtor teria uma lista enorme de parâmetros, tornando o código propenso a erros (ex: trocar a ordem de dois parâmetros String). O Builder oferece uma API fluente e autoexplicativa, além de centralizar as validações antes de criar o objeto.</w:t>
+      </w:r>
+    </w:p>
+    <w:p>
+      <w:pPr>
+        <w:spacing w:before="240" w:after="80"/>
+        <w:jc w:val="both"/>
+      </w:pPr>
+      <w:r>
+        <w:rPr>
+          <w:rFonts w:ascii="Times New Roman" w:hAnsi="Times New Roman"/>
+          <w:b/>
+          <w:i w:val="0"/>
+          <w:sz w:val="24"/>
+        </w:rPr>
+        <w:t xml:space="preserve">Pergunta 7: </w:t>
+      </w:r>
+      <w:r>
+        <w:rPr>
+          <w:rFonts w:ascii="Times New Roman" w:hAnsi="Times New Roman"/>
+          <w:b w:val="0"/>
+          <w:i/>
+          <w:sz w:val="24"/>
+        </w:rPr>
+        <w:t>Como a Herança e os 6 tipos de relacionamentos de POO estão implementados no código?</w:t>
+      </w:r>
+    </w:p>
+    <w:p>
+      <w:pPr>
+        <w:spacing w:before="0" w:after="120" w:line="360" w:lineRule="auto"/>
+        <w:ind w:left="709"/>
+        <w:jc w:val="both"/>
+      </w:pPr>
+      <w:r>
+        <w:rPr>
+          <w:rFonts w:ascii="Times New Roman" w:hAnsi="Times New Roman"/>
+          <w:b/>
+          <w:i w:val="0"/>
+          <w:sz w:val="24"/>
+        </w:rPr>
+        <w:t xml:space="preserve">Resposta: </w:t>
+      </w:r>
+      <w:r>
+        <w:rPr>
+          <w:rFonts w:ascii="Times New Roman" w:hAnsi="Times New Roman"/>
+          <w:b w:val="0"/>
+          <w:i w:val="0"/>
+          <w:sz w:val="24"/>
+        </w:rPr>
+        <w:t>O sistema contempla todos os 6 relacionamentos: (1) Dependência (Commands chamando Services); (2) Associação 1:1 (OrdemServico e FichaTecnica); (3) Associação 1:N (Cliente para Equipamentos, Equipamento para Orcamentos); (4) Composição/Agregação (ciclo de vida de OS e Ficha Técnica); (5) Herança/Generalização (superclasse abstrata Pessoa estendida por Cliente e Usuario); e (6) Implementação (ClienteDAOJDBC implementa ClienteDAO e Commands implementam ICommand).</w:t>
       </w:r>
     </w:p>
     <w:p>

</xml_diff>

<commit_message>
docs: atualiza Diagrama de Classes com superclasse Pessoa (Heranca) e regenera ABNT docx
</commit_message>
<xml_diff>
--- a/APRESENTACAO_ABNT.docx
+++ b/APRESENTACAO_ABNT.docx
@@ -1214,7 +1214,7 @@
       <w:r>
         <w:drawing>
           <wp:inline xmlns:a="http://schemas.openxmlformats.org/drawingml/2006/main" xmlns:pic="http://schemas.openxmlformats.org/drawingml/2006/picture">
-            <wp:extent cx="5486400" cy="6035169"/>
+            <wp:extent cx="5486400" cy="9365673"/>
             <wp:docPr id="1" name="Picture 1"/>
             <wp:cNvGraphicFramePr>
               <a:graphicFrameLocks noChangeAspect="1"/>
@@ -1235,7 +1235,7 @@
                   <pic:spPr>
                     <a:xfrm>
                       <a:off x="0" y="0"/>
-                      <a:ext cx="5486400" cy="6035169"/>
+                      <a:ext cx="5486400" cy="9365673"/>
                     </a:xfrm>
                     <a:prstGeom prst="rect"/>
                   </pic:spPr>

</xml_diff>

<commit_message>
docs: revisa e atualiza diagramas de Dominio e Arquitetura/Padroes com UML 2.5.1 completa
</commit_message>
<xml_diff>
--- a/APRESENTACAO_ABNT.docx
+++ b/APRESENTACAO_ABNT.docx
@@ -1297,7 +1297,7 @@
       <w:r>
         <w:drawing>
           <wp:inline xmlns:a="http://schemas.openxmlformats.org/drawingml/2006/main" xmlns:pic="http://schemas.openxmlformats.org/drawingml/2006/picture">
-            <wp:extent cx="5486400" cy="4828768"/>
+            <wp:extent cx="5486400" cy="2177951"/>
             <wp:docPr id="2" name="Picture 2"/>
             <wp:cNvGraphicFramePr>
               <a:graphicFrameLocks noChangeAspect="1"/>
@@ -1318,7 +1318,7 @@
                   <pic:spPr>
                     <a:xfrm>
                       <a:off x="0" y="0"/>
-                      <a:ext cx="5486400" cy="4828768"/>
+                      <a:ext cx="5486400" cy="2177951"/>
                     </a:xfrm>
                     <a:prstGeom prst="rect"/>
                   </pic:spPr>

</xml_diff>